<commit_message>
Clase practica 3 y 4
</commit_message>
<xml_diff>
--- a/PROYECTO FINAL/PLANIFICACIÓN DE AUDITORÍA DE REDES.docx
+++ b/PROYECTO FINAL/PLANIFICACIÓN DE AUDITORÍA DE REDES.docx
@@ -9777,7 +9777,18 @@
           <w:lang w:val="es-US"/>
         </w:rPr>
         <w:lastRenderedPageBreak/>
-        <w:t>4. Elaborar una Matriz de Riesgo (áreas a evaluar)</w:t>
+        <w:t>4. Elaboración de</w:t>
+      </w:r>
+      <w:r>
+        <w:rPr>
+          <w:rFonts w:ascii="Arial" w:hAnsi="Arial" w:cs="Arial"/>
+          <w:b/>
+          <w:bCs/>
+          <w:sz w:val="28"/>
+          <w:szCs w:val="28"/>
+          <w:lang w:val="es-US"/>
+        </w:rPr>
+        <w:t xml:space="preserve"> una Matriz de Riesgo (áreas a evaluar)</w:t>
       </w:r>
     </w:p>
     <w:p>
@@ -11855,6 +11866,8 @@
           <w:rFonts w:ascii="Arial" w:hAnsi="Arial" w:cs="Arial"/>
           <w:b/>
           <w:bCs/>
+          <w:sz w:val="28"/>
+          <w:szCs w:val="28"/>
           <w:lang w:val="es-US"/>
         </w:rPr>
       </w:pPr>
@@ -11863,6 +11876,8 @@
           <w:rFonts w:ascii="Arial" w:hAnsi="Arial" w:cs="Arial"/>
           <w:b/>
           <w:bCs/>
+          <w:sz w:val="28"/>
+          <w:szCs w:val="28"/>
           <w:lang w:val="es-US"/>
         </w:rPr>
         <w:lastRenderedPageBreak/>
@@ -18856,6 +18871,8 @@
             </w:r>
           </w:p>
         </w:tc>
+        <w:bookmarkStart w:id="0" w:name="_GoBack"/>
+        <w:bookmarkEnd w:id="0"/>
       </w:tr>
       <w:tr>
         <w:tc>
@@ -23722,8 +23739,6 @@
           <w:lang w:val="es-US"/>
         </w:rPr>
       </w:pPr>
-      <w:bookmarkStart w:id="0" w:name="_GoBack"/>
-      <w:bookmarkEnd w:id="0"/>
       <w:r>
         <w:rPr>
           <w:rFonts w:ascii="Arial" w:hAnsi="Arial" w:cs="Arial"/>
@@ -27532,6 +27547,7 @@
   <w:style w:type="character" w:default="1" w:styleId="Fuentedeprrafopredeter">
     <w:name w:val="Default Paragraph Font"/>
     <w:uiPriority w:val="1"/>
+    <w:semiHidden/>
     <w:unhideWhenUsed/>
   </w:style>
   <w:style w:type="table" w:default="1" w:styleId="Tablanormal">

</xml_diff>